<commit_message>
AI New Asian State
</commit_message>
<xml_diff>
--- a/AI-Economics-IR/PP518x-2026t27-AI-New-Asian-State/DQ-2026.10-AI-New-Asian-State-AI-checklist.docx
+++ b/AI-Economics-IR/PP518x-2026t27-AI-New-Asian-State/DQ-2026.10-AI-New-Asian-State-AI-checklist.docx
@@ -228,6 +228,84 @@
         </w:rPr>
         <w:t xml:space="preserve"> involves AI?</w:t>
       </w:r>
+      <w:r>
+        <w:rPr>
+          <w:color w:val="EE0000"/>
+        </w:rPr>
+        <w:t xml:space="preserve">  DQ:  I need AA and maybe NUS to clarify what you mean by “that involves AI”.  All 13 weeks of my course study AI-related political economy.  But</w:t>
+      </w:r>
+      <w:r>
+        <w:rPr>
+          <w:color w:val="EE0000"/>
+        </w:rPr>
+        <w:t xml:space="preserve"> that is different from</w:t>
+      </w:r>
+      <w:r>
+        <w:rPr>
+          <w:color w:val="EE0000"/>
+        </w:rPr>
+        <w:t xml:space="preserve"> “using AI” (as in </w:t>
+      </w:r>
+      <w:r>
+        <w:rPr>
+          <w:color w:val="EE0000"/>
+        </w:rPr>
+        <w:t>calling up</w:t>
+      </w:r>
+      <w:r>
+        <w:rPr>
+          <w:color w:val="EE0000"/>
+        </w:rPr>
+        <w:t xml:space="preserve"> ChatGPT or Claude) to get work done</w:t>
+      </w:r>
+      <w:r>
+        <w:rPr>
+          <w:color w:val="EE0000"/>
+        </w:rPr>
+        <w:t>. I am having students</w:t>
+      </w:r>
+      <w:r>
+        <w:rPr>
+          <w:color w:val="EE0000"/>
+        </w:rPr>
+        <w:t xml:space="preserve"> studying AI-related political economy – which doesn’t actually require </w:t>
+      </w:r>
+      <w:r>
+        <w:rPr>
+          <w:color w:val="EE0000"/>
+        </w:rPr>
+        <w:t xml:space="preserve">hands-on </w:t>
+      </w:r>
+      <w:r>
+        <w:rPr>
+          <w:color w:val="EE0000"/>
+        </w:rPr>
+        <w:t xml:space="preserve">using an LLM or </w:t>
+      </w:r>
+      <w:r>
+        <w:rPr>
+          <w:color w:val="EE0000"/>
+        </w:rPr>
+        <w:t xml:space="preserve">technical </w:t>
+      </w:r>
+      <w:r>
+        <w:rPr>
+          <w:color w:val="EE0000"/>
+        </w:rPr>
+        <w:t>AI</w:t>
+      </w:r>
+      <w:r>
+        <w:rPr>
+          <w:color w:val="EE0000"/>
+        </w:rPr>
+        <w:t xml:space="preserve"> content</w:t>
+      </w:r>
+      <w:r>
+        <w:rPr>
+          <w:color w:val="EE0000"/>
+        </w:rPr>
+        <w:t xml:space="preserve"> at all.  </w:t>
+      </w:r>
     </w:p>
     <w:p>
       <w:pPr>
@@ -237,7 +315,7 @@
         <w:sdtPr>
           <w:id w:val="-2017760422"/>
           <w14:checkbox>
-            <w14:checked w14:val="1"/>
+            <w14:checked w14:val="0"/>
             <w14:checkedState w14:val="2612" w14:font="MS Gothic"/>
             <w14:uncheckedState w14:val="2610" w14:font="MS Gothic"/>
           </w14:checkbox>
@@ -247,7 +325,7 @@
             <w:rPr>
               <w:rFonts w:ascii="MS Gothic" w:eastAsia="MS Gothic" w:hAnsi="MS Gothic" w:hint="eastAsia"/>
             </w:rPr>
-            <w:t>☒</w:t>
+            <w:t>☐</w:t>
           </w:r>
         </w:sdtContent>
       </w:sdt>

</xml_diff>